<commit_message>
change data directory auto create
</commit_message>
<xml_diff>
--- a/common/Описания и ТЗ.docx
+++ b/common/Описания и ТЗ.docx
@@ -52,26 +52,13 @@
         <w:spacing w:line="360" w:lineRule="auto"/>
         <w:rPr>
           <w:rFonts w:ascii="Times New Roman" w:hAnsi="Times New Roman" w:cs="Times New Roman"/>
-          <w:lang w:val="en-US"/>
         </w:rPr>
       </w:pPr>
       <w:r>
         <w:rPr>
           <w:rFonts w:ascii="Times New Roman" w:hAnsi="Times New Roman" w:cs="Times New Roman"/>
         </w:rPr>
-        <w:t>Описание Проекта</w:t>
-      </w:r>
-      <w:r>
-        <w:rPr>
-          <w:rFonts w:ascii="Times New Roman" w:hAnsi="Times New Roman" w:cs="Times New Roman"/>
-        </w:rPr>
-        <w:t xml:space="preserve">: </w:t>
-      </w:r>
-      <w:r>
-        <w:rPr>
-          <w:rFonts w:ascii="Times New Roman" w:hAnsi="Times New Roman" w:cs="Times New Roman"/>
-        </w:rPr>
-        <w:t>Мой проект — это разработка классического 2D-платформера "</w:t>
+        <w:t>Описание Проекта: Мой проект — это разработка классического 2D-платформера "</w:t>
       </w:r>
       <w:proofErr w:type="spellStart"/>
       <w:r>
@@ -107,7 +94,6 @@
         <w:spacing w:line="360" w:lineRule="auto"/>
         <w:rPr>
           <w:rFonts w:ascii="Times New Roman" w:hAnsi="Times New Roman" w:cs="Times New Roman"/>
-          <w:lang w:val="en-US"/>
         </w:rPr>
       </w:pPr>
       <w:r>
@@ -122,7 +108,6 @@
         <w:spacing w:line="360" w:lineRule="auto"/>
         <w:rPr>
           <w:rFonts w:ascii="Times New Roman" w:hAnsi="Times New Roman" w:cs="Times New Roman"/>
-          <w:lang w:val="en-US"/>
         </w:rPr>
       </w:pPr>
       <w:r>
@@ -143,7 +128,7 @@
         <w:rPr>
           <w:rFonts w:ascii="Times New Roman" w:hAnsi="Times New Roman" w:cs="Times New Roman"/>
         </w:rPr>
-        <w:t>), включая уникальные препятствия на каждом из них. С</w:t>
+        <w:t xml:space="preserve">), включая уникальные препятствия на каждом из них. </w:t>
       </w:r>
     </w:p>
     <w:p>
@@ -151,22 +136,13 @@
         <w:spacing w:line="360" w:lineRule="auto"/>
         <w:rPr>
           <w:rFonts w:ascii="Times New Roman" w:hAnsi="Times New Roman" w:cs="Times New Roman"/>
-          <w:lang w:val="en-US"/>
         </w:rPr>
       </w:pPr>
-      <w:proofErr w:type="spellStart"/>
       <w:r>
         <w:rPr>
           <w:rFonts w:ascii="Times New Roman" w:hAnsi="Times New Roman" w:cs="Times New Roman"/>
         </w:rPr>
-        <w:t>истема</w:t>
-      </w:r>
-      <w:proofErr w:type="spellEnd"/>
-      <w:r>
-        <w:rPr>
-          <w:rFonts w:ascii="Times New Roman" w:hAnsi="Times New Roman" w:cs="Times New Roman"/>
-        </w:rPr>
-        <w:t xml:space="preserve"> Анимаций: Персонаж будет обладать набором анимаций (бег, прыжок, покой), что делает игровой процесс более живым. </w:t>
+        <w:t xml:space="preserve">Система Анимаций: Персонаж будет обладать набором анимаций (бег, прыжок, покой), что делает игровой процесс более живым. </w:t>
       </w:r>
     </w:p>
     <w:p>
@@ -174,7 +150,6 @@
         <w:spacing w:line="360" w:lineRule="auto"/>
         <w:rPr>
           <w:rFonts w:ascii="Times New Roman" w:hAnsi="Times New Roman" w:cs="Times New Roman"/>
-          <w:lang w:val="en-US"/>
         </w:rPr>
       </w:pPr>
       <w:r>
@@ -203,7 +178,6 @@
         <w:spacing w:line="360" w:lineRule="auto"/>
         <w:rPr>
           <w:rFonts w:ascii="Times New Roman" w:hAnsi="Times New Roman" w:cs="Times New Roman"/>
-          <w:lang w:val="en-US"/>
         </w:rPr>
       </w:pPr>
       <w:r>
@@ -3320,6 +3294,7 @@
   <w:style w:type="character" w:default="1" w:styleId="a0">
     <w:name w:val="Default Paragraph Font"/>
     <w:uiPriority w:val="1"/>
+    <w:semiHidden/>
     <w:unhideWhenUsed/>
   </w:style>
   <w:style w:type="table" w:default="1" w:styleId="a1">

</xml_diff>

<commit_message>
add presintation & changed description
</commit_message>
<xml_diff>
--- a/common/Описания и ТЗ.docx
+++ b/common/Описания и ТЗ.docx
@@ -1,6 +1,6 @@
 
 <file path=word/document.xml><?xml version="1.0" encoding="utf-8"?>
-<w:document xmlns:wpc="http://schemas.microsoft.com/office/word/2010/wordprocessingCanvas" xmlns:cx="http://schemas.microsoft.com/office/drawing/2014/chartex" xmlns:cx1="http://schemas.microsoft.com/office/drawing/2015/9/8/chartex" xmlns:cx2="http://schemas.microsoft.com/office/drawing/2015/10/21/chartex" xmlns:cx3="http://schemas.microsoft.com/office/drawing/2016/5/9/chartex" xmlns:cx4="http://schemas.microsoft.com/office/drawing/2016/5/10/chartex" xmlns:cx5="http://schemas.microsoft.com/office/drawing/2016/5/11/chartex" xmlns:cx6="http://schemas.microsoft.com/office/drawing/2016/5/12/chartex" xmlns:cx7="http://schemas.microsoft.com/office/drawing/2016/5/13/chartex" xmlns:cx8="http://schemas.microsoft.com/office/drawing/2016/5/14/chartex" xmlns:mc="http://schemas.openxmlformats.org/markup-compatibility/2006" xmlns:aink="http://schemas.microsoft.com/office/drawing/2016/ink" xmlns:am3d="http://schemas.microsoft.com/office/drawing/2017/model3d" xmlns:o="urn:schemas-microsoft-com:office:office" xmlns:oel="http://schemas.microsoft.com/office/2019/extlst" xmlns:r="http://schemas.openxmlformats.org/officeDocument/2006/relationships" xmlns:m="http://schemas.openxmlformats.org/officeDocument/2006/math" xmlns:v="urn:schemas-microsoft-com:vml" xmlns:wp14="http://schemas.microsoft.com/office/word/2010/wordprocessingDrawing" xmlns:wp="http://schemas.openxmlformats.org/drawingml/2006/wordprocessingDrawing" xmlns:w10="urn:schemas-microsoft-com:office:word" xmlns:w="http://schemas.openxmlformats.org/wordprocessingml/2006/main" xmlns:w14="http://schemas.microsoft.com/office/word/2010/wordml" xmlns:w15="http://schemas.microsoft.com/office/word/2012/wordml" xmlns:w16cex="http://schemas.microsoft.com/office/word/2018/wordml/cex" xmlns:w16cid="http://schemas.microsoft.com/office/word/2016/wordml/cid" xmlns:w16="http://schemas.microsoft.com/office/word/2018/wordml" xmlns:w16du="http://schemas.microsoft.com/office/word/2023/wordml/word16du" xmlns:w16sdtdh="http://schemas.microsoft.com/office/word/2020/wordml/sdtdatahash" xmlns:w16sdtfl="http://schemas.microsoft.com/office/word/2024/wordml/sdtformatlock" xmlns:w16se="http://schemas.microsoft.com/office/word/2015/wordml/symex" xmlns:wpg="http://schemas.microsoft.com/office/word/2010/wordprocessingGroup" xmlns:wpi="http://schemas.microsoft.com/office/word/2010/wordprocessingInk" xmlns:wne="http://schemas.microsoft.com/office/word/2006/wordml" xmlns:wps="http://schemas.microsoft.com/office/word/2010/wordprocessingShape" mc:Ignorable="w14 w15 w16se w16cid w16 w16cex w16sdtdh w16sdtfl w16du wp14">
+<w:document xmlns:wpc="http://schemas.microsoft.com/office/word/2010/wordprocessingCanvas" xmlns:cx="http://schemas.microsoft.com/office/drawing/2014/chartex" xmlns:cx1="http://schemas.microsoft.com/office/drawing/2015/9/8/chartex" xmlns:cx2="http://schemas.microsoft.com/office/drawing/2015/10/21/chartex" xmlns:cx3="http://schemas.microsoft.com/office/drawing/2016/5/9/chartex" xmlns:cx4="http://schemas.microsoft.com/office/drawing/2016/5/10/chartex" xmlns:cx5="http://schemas.microsoft.com/office/drawing/2016/5/11/chartex" xmlns:cx6="http://schemas.microsoft.com/office/drawing/2016/5/12/chartex" xmlns:cx7="http://schemas.microsoft.com/office/drawing/2016/5/13/chartex" xmlns:cx8="http://schemas.microsoft.com/office/drawing/2016/5/14/chartex" xmlns:mc="http://schemas.openxmlformats.org/markup-compatibility/2006" xmlns:aink="http://schemas.microsoft.com/office/drawing/2016/ink" xmlns:am3d="http://schemas.microsoft.com/office/drawing/2017/model3d" xmlns:o="urn:schemas-microsoft-com:office:office" xmlns:oel="http://schemas.microsoft.com/office/2019/extlst" xmlns:r="http://schemas.openxmlformats.org/officeDocument/2006/relationships" xmlns:m="http://schemas.openxmlformats.org/officeDocument/2006/math" xmlns:v="urn:schemas-microsoft-com:vml" xmlns:wp14="http://schemas.microsoft.com/office/word/2010/wordprocessingDrawing" xmlns:wp="http://schemas.openxmlformats.org/drawingml/2006/wordprocessingDrawing" xmlns:w10="urn:schemas-microsoft-com:office:word" xmlns:w="http://schemas.openxmlformats.org/wordprocessingml/2006/main" xmlns:w14="http://schemas.microsoft.com/office/word/2010/wordml" xmlns:w15="http://schemas.microsoft.com/office/word/2012/wordml" xmlns:w16cex="http://schemas.microsoft.com/office/word/2018/wordml/cex" xmlns:w16cid="http://schemas.microsoft.com/office/word/2016/wordml/cid" xmlns:w16="http://schemas.microsoft.com/office/word/2018/wordml" xmlns:w16sdtdh="http://schemas.microsoft.com/office/word/2020/wordml/sdtdatahash" xmlns:w16se="http://schemas.microsoft.com/office/word/2015/wordml/symex" xmlns:wpg="http://schemas.microsoft.com/office/word/2010/wordprocessingGroup" xmlns:wpi="http://schemas.microsoft.com/office/word/2010/wordprocessingInk" xmlns:wne="http://schemas.microsoft.com/office/word/2006/wordml" xmlns:wps="http://schemas.microsoft.com/office/word/2010/wordprocessingShape" mc:Ignorable="w14 w15 w16se w16cid w16 w16cex w16sdtdh wp14">
   <w:body>
     <w:p>
       <w:pPr>
@@ -22,7 +22,7 @@
           <w:sz w:val="28"/>
           <w:szCs w:val="28"/>
         </w:rPr>
-        <w:t>Описание Проекта: Платформер "</w:t>
+        <w:t xml:space="preserve">Описание Проекта: </w:t>
       </w:r>
       <w:proofErr w:type="spellStart"/>
       <w:r>
@@ -33,6 +33,28 @@
           <w:sz w:val="28"/>
           <w:szCs w:val="28"/>
         </w:rPr>
+        <w:t>Платформер</w:t>
+      </w:r>
+      <w:proofErr w:type="spellEnd"/>
+      <w:r>
+        <w:rPr>
+          <w:rFonts w:ascii="Times New Roman" w:hAnsi="Times New Roman" w:cs="Times New Roman"/>
+          <w:b/>
+          <w:bCs/>
+          <w:sz w:val="28"/>
+          <w:szCs w:val="28"/>
+        </w:rPr>
+        <w:t xml:space="preserve"> "</w:t>
+      </w:r>
+      <w:proofErr w:type="spellStart"/>
+      <w:r>
+        <w:rPr>
+          <w:rFonts w:ascii="Times New Roman" w:hAnsi="Times New Roman" w:cs="Times New Roman"/>
+          <w:b/>
+          <w:bCs/>
+          <w:sz w:val="28"/>
+          <w:szCs w:val="28"/>
+        </w:rPr>
         <w:t>PyJourney</w:t>
       </w:r>
       <w:proofErr w:type="spellEnd"/>
@@ -156,21 +178,7 @@
         <w:rPr>
           <w:rFonts w:ascii="Times New Roman" w:hAnsi="Times New Roman" w:cs="Times New Roman"/>
         </w:rPr>
-        <w:t>Физическое Взаимодействие</w:t>
-      </w:r>
-      <w:proofErr w:type="gramStart"/>
-      <w:r>
-        <w:rPr>
-          <w:rFonts w:ascii="Times New Roman" w:hAnsi="Times New Roman" w:cs="Times New Roman"/>
-        </w:rPr>
-        <w:t>: Будет</w:t>
-      </w:r>
-      <w:proofErr w:type="gramEnd"/>
-      <w:r>
-        <w:rPr>
-          <w:rFonts w:ascii="Times New Roman" w:hAnsi="Times New Roman" w:cs="Times New Roman"/>
-        </w:rPr>
-        <w:t xml:space="preserve"> реализована честная физика прыжков, падений и столкновений с объектами и врагами. </w:t>
+        <w:t xml:space="preserve">Физическое Взаимодействие: Будет реализована честная физика прыжков, падений и столкновений с объектами и врагами. </w:t>
       </w:r>
     </w:p>
     <w:p>
@@ -674,7 +682,7 @@
     </w:p>
     <w:tbl>
       <w:tblPr>
-        <w:tblW w:w="0" w:type="dxa"/>
+        <w:tblW w:w="6158" w:type="dxa"/>
         <w:tblCellMar>
           <w:left w:w="0" w:type="dxa"/>
           <w:right w:w="0" w:type="dxa"/>
@@ -786,112 +794,6 @@
                 <w:rFonts w:ascii="Times New Roman" w:hAnsi="Times New Roman" w:cs="Times New Roman"/>
               </w:rPr>
               <w:t>Описание</w:t>
-            </w:r>
-          </w:p>
-        </w:tc>
-      </w:tr>
-      <w:tr>
-        <w:trPr>
-          <w:trHeight w:val="315"/>
-        </w:trPr>
-        <w:tc>
-          <w:tcPr>
-            <w:tcW w:w="0" w:type="auto"/>
-            <w:tcBorders>
-              <w:top w:val="single" w:sz="6" w:space="0" w:color="CCCCCC"/>
-              <w:left w:val="single" w:sz="6" w:space="0" w:color="CCCCCC"/>
-              <w:bottom w:val="single" w:sz="6" w:space="0" w:color="CCCCCC"/>
-              <w:right w:val="single" w:sz="6" w:space="0" w:color="CCCCCC"/>
-            </w:tcBorders>
-            <w:tcMar>
-              <w:top w:w="30" w:type="dxa"/>
-              <w:left w:w="45" w:type="dxa"/>
-              <w:bottom w:w="30" w:type="dxa"/>
-              <w:right w:w="45" w:type="dxa"/>
-            </w:tcMar>
-            <w:vAlign w:val="bottom"/>
-            <w:hideMark/>
-          </w:tcPr>
-          <w:p>
-            <w:pPr>
-              <w:spacing w:line="360" w:lineRule="auto"/>
-              <w:rPr>
-                <w:rFonts w:ascii="Times New Roman" w:hAnsi="Times New Roman" w:cs="Times New Roman"/>
-              </w:rPr>
-            </w:pPr>
-            <w:proofErr w:type="spellStart"/>
-            <w:r>
-              <w:rPr>
-                <w:rFonts w:ascii="Times New Roman" w:hAnsi="Times New Roman" w:cs="Times New Roman"/>
-              </w:rPr>
-              <w:t>player_id</w:t>
-            </w:r>
-            <w:proofErr w:type="spellEnd"/>
-          </w:p>
-        </w:tc>
-        <w:tc>
-          <w:tcPr>
-            <w:tcW w:w="0" w:type="auto"/>
-            <w:tcBorders>
-              <w:top w:val="single" w:sz="6" w:space="0" w:color="CCCCCC"/>
-              <w:left w:val="single" w:sz="6" w:space="0" w:color="CCCCCC"/>
-              <w:bottom w:val="single" w:sz="6" w:space="0" w:color="CCCCCC"/>
-              <w:right w:val="single" w:sz="6" w:space="0" w:color="CCCCCC"/>
-            </w:tcBorders>
-            <w:tcMar>
-              <w:top w:w="30" w:type="dxa"/>
-              <w:left w:w="45" w:type="dxa"/>
-              <w:bottom w:w="30" w:type="dxa"/>
-              <w:right w:w="45" w:type="dxa"/>
-            </w:tcMar>
-            <w:vAlign w:val="bottom"/>
-            <w:hideMark/>
-          </w:tcPr>
-          <w:p>
-            <w:pPr>
-              <w:spacing w:line="360" w:lineRule="auto"/>
-              <w:rPr>
-                <w:rFonts w:ascii="Times New Roman" w:hAnsi="Times New Roman" w:cs="Times New Roman"/>
-              </w:rPr>
-            </w:pPr>
-            <w:r>
-              <w:rPr>
-                <w:rFonts w:ascii="Times New Roman" w:hAnsi="Times New Roman" w:cs="Times New Roman"/>
-              </w:rPr>
-              <w:t>INT (PK)</w:t>
-            </w:r>
-          </w:p>
-        </w:tc>
-        <w:tc>
-          <w:tcPr>
-            <w:tcW w:w="0" w:type="auto"/>
-            <w:tcBorders>
-              <w:top w:val="single" w:sz="6" w:space="0" w:color="CCCCCC"/>
-              <w:left w:val="single" w:sz="6" w:space="0" w:color="CCCCCC"/>
-              <w:bottom w:val="single" w:sz="6" w:space="0" w:color="CCCCCC"/>
-              <w:right w:val="single" w:sz="6" w:space="0" w:color="CCCCCC"/>
-            </w:tcBorders>
-            <w:tcMar>
-              <w:top w:w="30" w:type="dxa"/>
-              <w:left w:w="0" w:type="dxa"/>
-              <w:bottom w:w="30" w:type="dxa"/>
-              <w:right w:w="0" w:type="dxa"/>
-            </w:tcMar>
-            <w:vAlign w:val="bottom"/>
-            <w:hideMark/>
-          </w:tcPr>
-          <w:p>
-            <w:pPr>
-              <w:spacing w:line="360" w:lineRule="auto"/>
-              <w:rPr>
-                <w:rFonts w:ascii="Times New Roman" w:hAnsi="Times New Roman" w:cs="Times New Roman"/>
-              </w:rPr>
-            </w:pPr>
-            <w:r>
-              <w:rPr>
-                <w:rFonts w:ascii="Times New Roman" w:hAnsi="Times New Roman" w:cs="Times New Roman"/>
-              </w:rPr>
-              <w:t>Уникальный ID игрока.</w:t>
             </w:r>
           </w:p>
         </w:tc>
@@ -2319,7 +2221,7 @@
 </file>
 
 <file path=word/numbering.xml><?xml version="1.0" encoding="utf-8"?>
-<w:numbering xmlns:wpc="http://schemas.microsoft.com/office/word/2010/wordprocessingCanvas" xmlns:cx="http://schemas.microsoft.com/office/drawing/2014/chartex" xmlns:cx1="http://schemas.microsoft.com/office/drawing/2015/9/8/chartex" xmlns:cx2="http://schemas.microsoft.com/office/drawing/2015/10/21/chartex" xmlns:cx3="http://schemas.microsoft.com/office/drawing/2016/5/9/chartex" xmlns:cx4="http://schemas.microsoft.com/office/drawing/2016/5/10/chartex" xmlns:cx5="http://schemas.microsoft.com/office/drawing/2016/5/11/chartex" xmlns:cx6="http://schemas.microsoft.com/office/drawing/2016/5/12/chartex" xmlns:cx7="http://schemas.microsoft.com/office/drawing/2016/5/13/chartex" xmlns:cx8="http://schemas.microsoft.com/office/drawing/2016/5/14/chartex" xmlns:mc="http://schemas.openxmlformats.org/markup-compatibility/2006" xmlns:aink="http://schemas.microsoft.com/office/drawing/2016/ink" xmlns:am3d="http://schemas.microsoft.com/office/drawing/2017/model3d" xmlns:o="urn:schemas-microsoft-com:office:office" xmlns:oel="http://schemas.microsoft.com/office/2019/extlst" xmlns:r="http://schemas.openxmlformats.org/officeDocument/2006/relationships" xmlns:m="http://schemas.openxmlformats.org/officeDocument/2006/math" xmlns:v="urn:schemas-microsoft-com:vml" xmlns:wp14="http://schemas.microsoft.com/office/word/2010/wordprocessingDrawing" xmlns:wp="http://schemas.openxmlformats.org/drawingml/2006/wordprocessingDrawing" xmlns:w10="urn:schemas-microsoft-com:office:word" xmlns:w="http://schemas.openxmlformats.org/wordprocessingml/2006/main" xmlns:w14="http://schemas.microsoft.com/office/word/2010/wordml" xmlns:w15="http://schemas.microsoft.com/office/word/2012/wordml" xmlns:w16cex="http://schemas.microsoft.com/office/word/2018/wordml/cex" xmlns:w16cid="http://schemas.microsoft.com/office/word/2016/wordml/cid" xmlns:w16="http://schemas.microsoft.com/office/word/2018/wordml" xmlns:w16du="http://schemas.microsoft.com/office/word/2023/wordml/word16du" xmlns:w16sdtdh="http://schemas.microsoft.com/office/word/2020/wordml/sdtdatahash" xmlns:w16sdtfl="http://schemas.microsoft.com/office/word/2024/wordml/sdtformatlock" xmlns:w16se="http://schemas.microsoft.com/office/word/2015/wordml/symex" xmlns:wpg="http://schemas.microsoft.com/office/word/2010/wordprocessingGroup" xmlns:wpi="http://schemas.microsoft.com/office/word/2010/wordprocessingInk" xmlns:wne="http://schemas.microsoft.com/office/word/2006/wordml" xmlns:wps="http://schemas.microsoft.com/office/word/2010/wordprocessingShape" mc:Ignorable="w14 w15 w16se w16cid w16 w16cex w16sdtdh w16sdtfl w16du wp14">
+<w:numbering xmlns:wpc="http://schemas.microsoft.com/office/word/2010/wordprocessingCanvas" xmlns:cx="http://schemas.microsoft.com/office/drawing/2014/chartex" xmlns:cx1="http://schemas.microsoft.com/office/drawing/2015/9/8/chartex" xmlns:cx2="http://schemas.microsoft.com/office/drawing/2015/10/21/chartex" xmlns:cx3="http://schemas.microsoft.com/office/drawing/2016/5/9/chartex" xmlns:cx4="http://schemas.microsoft.com/office/drawing/2016/5/10/chartex" xmlns:cx5="http://schemas.microsoft.com/office/drawing/2016/5/11/chartex" xmlns:cx6="http://schemas.microsoft.com/office/drawing/2016/5/12/chartex" xmlns:cx7="http://schemas.microsoft.com/office/drawing/2016/5/13/chartex" xmlns:cx8="http://schemas.microsoft.com/office/drawing/2016/5/14/chartex" xmlns:mc="http://schemas.openxmlformats.org/markup-compatibility/2006" xmlns:aink="http://schemas.microsoft.com/office/drawing/2016/ink" xmlns:am3d="http://schemas.microsoft.com/office/drawing/2017/model3d" xmlns:o="urn:schemas-microsoft-com:office:office" xmlns:oel="http://schemas.microsoft.com/office/2019/extlst" xmlns:r="http://schemas.openxmlformats.org/officeDocument/2006/relationships" xmlns:m="http://schemas.openxmlformats.org/officeDocument/2006/math" xmlns:v="urn:schemas-microsoft-com:vml" xmlns:wp14="http://schemas.microsoft.com/office/word/2010/wordprocessingDrawing" xmlns:wp="http://schemas.openxmlformats.org/drawingml/2006/wordprocessingDrawing" xmlns:w10="urn:schemas-microsoft-com:office:word" xmlns:w="http://schemas.openxmlformats.org/wordprocessingml/2006/main" xmlns:w14="http://schemas.microsoft.com/office/word/2010/wordml" xmlns:w15="http://schemas.microsoft.com/office/word/2012/wordml" xmlns:w16cex="http://schemas.microsoft.com/office/word/2018/wordml/cex" xmlns:w16cid="http://schemas.microsoft.com/office/word/2016/wordml/cid" xmlns:w16="http://schemas.microsoft.com/office/word/2018/wordml" xmlns:w16sdtdh="http://schemas.microsoft.com/office/word/2020/wordml/sdtdatahash" xmlns:w16se="http://schemas.microsoft.com/office/word/2015/wordml/symex" xmlns:wpg="http://schemas.microsoft.com/office/word/2010/wordprocessingGroup" xmlns:wpi="http://schemas.microsoft.com/office/word/2010/wordprocessingInk" xmlns:wne="http://schemas.microsoft.com/office/word/2006/wordml" xmlns:wps="http://schemas.microsoft.com/office/word/2010/wordprocessingShape" mc:Ignorable="w14 w15 w16se w16cid w16 w16cex w16sdtdh wp14">
   <w:abstractNum w:abstractNumId="0" w15:restartNumberingAfterBreak="0">
     <w:nsid w:val="33FE49C4"/>
     <w:multiLevelType w:val="hybridMultilevel"/>
@@ -2692,7 +2594,7 @@
 </file>
 
 <file path=word/styles.xml><?xml version="1.0" encoding="utf-8"?>
-<w:styles xmlns:mc="http://schemas.openxmlformats.org/markup-compatibility/2006" xmlns:r="http://schemas.openxmlformats.org/officeDocument/2006/relationships" xmlns:w="http://schemas.openxmlformats.org/wordprocessingml/2006/main" xmlns:w14="http://schemas.microsoft.com/office/word/2010/wordml" xmlns:w15="http://schemas.microsoft.com/office/word/2012/wordml" xmlns:w16cex="http://schemas.microsoft.com/office/word/2018/wordml/cex" xmlns:w16cid="http://schemas.microsoft.com/office/word/2016/wordml/cid" xmlns:w16="http://schemas.microsoft.com/office/word/2018/wordml" xmlns:w16du="http://schemas.microsoft.com/office/word/2023/wordml/word16du" xmlns:w16sdtdh="http://schemas.microsoft.com/office/word/2020/wordml/sdtdatahash" xmlns:w16sdtfl="http://schemas.microsoft.com/office/word/2024/wordml/sdtformatlock" xmlns:w16se="http://schemas.microsoft.com/office/word/2015/wordml/symex" mc:Ignorable="w14 w15 w16se w16cid w16 w16cex w16sdtdh w16sdtfl w16du">
+<w:styles xmlns:mc="http://schemas.openxmlformats.org/markup-compatibility/2006" xmlns:r="http://schemas.openxmlformats.org/officeDocument/2006/relationships" xmlns:w="http://schemas.openxmlformats.org/wordprocessingml/2006/main" xmlns:w14="http://schemas.microsoft.com/office/word/2010/wordml" xmlns:w15="http://schemas.microsoft.com/office/word/2012/wordml" xmlns:w16cex="http://schemas.microsoft.com/office/word/2018/wordml/cex" xmlns:w16cid="http://schemas.microsoft.com/office/word/2016/wordml/cid" xmlns:w16="http://schemas.microsoft.com/office/word/2018/wordml" xmlns:w16sdtdh="http://schemas.microsoft.com/office/word/2020/wordml/sdtdatahash" xmlns:w16se="http://schemas.microsoft.com/office/word/2015/wordml/symex" mc:Ignorable="w14 w15 w16se w16cid w16 w16cex w16sdtdh">
   <w:docDefaults>
     <w:rPrDefault>
       <w:rPr>

</xml_diff>